<commit_message>
Complete CEP traffic alert system alignment
</commit_message>
<xml_diff>
--- a/report/CEP_Report.docx
+++ b/report/CEP_Report.docx
@@ -279,7 +279,7 @@
           <w:rFonts w:ascii="Times New Roman" w:hAnsi="Times New Roman"/>
           <w:sz w:val="24"/>
         </w:rPr>
-        <w:t>This module defines the four event dataclasses that represent domain occurrences in the traffic monitoring system. Each event is a simple data container decorated with @dataclass for automatic constructor generation and clean string representation.</w:t>
+        <w:t>This module defines the four required event dataclasses plus a fifth EmergencyVehicleEvent used to demonstrate extensibility. VehicleDetectedEvent keeps lane_number optional so old producers and subscribers remain compatible with the evolved schema.</w:t>
       </w:r>
     </w:p>
     <w:p>
@@ -417,7 +417,7 @@
           <w:sz w:val="18"/>
           <w:shd w:val="clear" w:color="auto" w:fill="F2F2F2"/>
         </w:rPr>
-        <w:t xml:space="preserve">    lane_number: int</w:t>
+        <w:t xml:space="preserve">    lane_number: int | None = None</w:t>
       </w:r>
     </w:p>
     <w:p>
@@ -762,6 +762,144 @@
           <w:shd w:val="clear" w:color="auto" w:fill="F2F2F2"/>
         </w:rPr>
         <w:t xml:space="preserve">    intersection_id: str</w:t>
+      </w:r>
+    </w:p>
+    <w:p>
+      <w:pPr>
+        <w:spacing w:before="0" w:after="0" w:line="240" w:lineRule="auto"/>
+      </w:pPr>
+      <w:r>
+        <w:rPr>
+          <w:rFonts w:ascii="Consolas" w:hAnsi="Consolas"/>
+          <w:color w:val="1E1E1E"/>
+          <w:sz w:val="18"/>
+          <w:shd w:val="clear" w:color="auto" w:fill="F2F2F2"/>
+        </w:rPr>
+        <w:t xml:space="preserve">    camera_id: str</w:t>
+      </w:r>
+    </w:p>
+    <w:p>
+      <w:pPr>
+        <w:spacing w:before="0" w:after="0" w:line="240" w:lineRule="auto"/>
+      </w:pPr>
+      <w:r>
+        <w:rPr>
+          <w:rFonts w:ascii="Consolas" w:hAnsi="Consolas"/>
+          <w:color w:val="1E1E1E"/>
+          <w:sz w:val="18"/>
+          <w:shd w:val="clear" w:color="auto" w:fill="F2F2F2"/>
+        </w:rPr>
+      </w:r>
+    </w:p>
+    <w:p>
+      <w:pPr>
+        <w:spacing w:before="0" w:after="0" w:line="240" w:lineRule="auto"/>
+      </w:pPr>
+      <w:r>
+        <w:rPr>
+          <w:rFonts w:ascii="Consolas" w:hAnsi="Consolas"/>
+          <w:color w:val="1E1E1E"/>
+          <w:sz w:val="18"/>
+          <w:shd w:val="clear" w:color="auto" w:fill="F2F2F2"/>
+        </w:rPr>
+      </w:r>
+    </w:p>
+    <w:p>
+      <w:pPr>
+        <w:spacing w:before="0" w:after="0" w:line="240" w:lineRule="auto"/>
+      </w:pPr>
+      <w:r>
+        <w:rPr>
+          <w:rFonts w:ascii="Consolas" w:hAnsi="Consolas"/>
+          <w:color w:val="1E1E1E"/>
+          <w:sz w:val="18"/>
+          <w:shd w:val="clear" w:color="auto" w:fill="F2F2F2"/>
+        </w:rPr>
+        <w:t># Published when an emergency vehicle is detected and needs priority handling.</w:t>
+      </w:r>
+    </w:p>
+    <w:p>
+      <w:pPr>
+        <w:spacing w:before="0" w:after="0" w:line="240" w:lineRule="auto"/>
+      </w:pPr>
+      <w:r>
+        <w:rPr>
+          <w:rFonts w:ascii="Consolas" w:hAnsi="Consolas"/>
+          <w:color w:val="1E1E1E"/>
+          <w:sz w:val="18"/>
+          <w:shd w:val="clear" w:color="auto" w:fill="F2F2F2"/>
+        </w:rPr>
+        <w:t>@dataclass</w:t>
+      </w:r>
+    </w:p>
+    <w:p>
+      <w:pPr>
+        <w:spacing w:before="0" w:after="0" w:line="240" w:lineRule="auto"/>
+      </w:pPr>
+      <w:r>
+        <w:rPr>
+          <w:rFonts w:ascii="Consolas" w:hAnsi="Consolas"/>
+          <w:color w:val="1E1E1E"/>
+          <w:sz w:val="18"/>
+          <w:shd w:val="clear" w:color="auto" w:fill="F2F2F2"/>
+        </w:rPr>
+        <w:t>class EmergencyVehicleEvent:</w:t>
+      </w:r>
+    </w:p>
+    <w:p>
+      <w:pPr>
+        <w:spacing w:before="0" w:after="0" w:line="240" w:lineRule="auto"/>
+      </w:pPr>
+      <w:r>
+        <w:rPr>
+          <w:rFonts w:ascii="Consolas" w:hAnsi="Consolas"/>
+          <w:color w:val="1E1E1E"/>
+          <w:sz w:val="18"/>
+          <w:shd w:val="clear" w:color="auto" w:fill="F2F2F2"/>
+        </w:rPr>
+        <w:t xml:space="preserve">    vehicle_id: str</w:t>
+      </w:r>
+    </w:p>
+    <w:p>
+      <w:pPr>
+        <w:spacing w:before="0" w:after="0" w:line="240" w:lineRule="auto"/>
+      </w:pPr>
+      <w:r>
+        <w:rPr>
+          <w:rFonts w:ascii="Consolas" w:hAnsi="Consolas"/>
+          <w:color w:val="1E1E1E"/>
+          <w:sz w:val="18"/>
+          <w:shd w:val="clear" w:color="auto" w:fill="F2F2F2"/>
+        </w:rPr>
+        <w:t xml:space="preserve">    plate_number: str</w:t>
+      </w:r>
+    </w:p>
+    <w:p>
+      <w:pPr>
+        <w:spacing w:before="0" w:after="0" w:line="240" w:lineRule="auto"/>
+      </w:pPr>
+      <w:r>
+        <w:rPr>
+          <w:rFonts w:ascii="Consolas" w:hAnsi="Consolas"/>
+          <w:color w:val="1E1E1E"/>
+          <w:sz w:val="18"/>
+          <w:shd w:val="clear" w:color="auto" w:fill="F2F2F2"/>
+        </w:rPr>
+        <w:t xml:space="preserve">    vehicle_type: str</w:t>
+      </w:r>
+    </w:p>
+    <w:p>
+      <w:pPr>
+        <w:spacing w:before="0" w:after="0" w:line="240" w:lineRule="auto"/>
+      </w:pPr>
+      <w:r>
+        <w:rPr>
+          <w:rFonts w:ascii="Consolas" w:hAnsi="Consolas"/>
+          <w:color w:val="1E1E1E"/>
+          <w:sz w:val="18"/>
+          <w:shd w:val="clear" w:color="auto" w:fill="F2F2F2"/>
+        </w:rPr>
+        <w:t xml:space="preserve">    priority_level: str</w:t>
       </w:r>
     </w:p>
     <w:p>
@@ -1414,7 +1552,47 @@
           <w:rFonts w:ascii="Times New Roman" w:hAnsi="Times New Roman"/>
           <w:sz w:val="24"/>
         </w:rPr>
-        <w:t>The EventBus class implements the Observer Pattern. It maintains a list of subscribers and provides subscribe(), unsubscribe(), and publish() methods. When an event is published, the bus iterates over all registered subscribers and delivers the envelope to each via on_event(). The bus is fully decoupled—it knows nothing about event types or subscriber implementations.</w:t>
+        <w:t>The EventBus class implements the Observer Pattern. It maintains a list of subscribers and provides subscribe(), unsubscribe(), publish(), flush(), and pending_count() methods. Published events are placed in per-subscriber queues and then delivered via on_event(). The bus is fully decoupled—it knows nothing about event types or subscriber implementations.</w:t>
+      </w:r>
+    </w:p>
+    <w:p>
+      <w:pPr>
+        <w:spacing w:before="0" w:after="0" w:line="240" w:lineRule="auto"/>
+      </w:pPr>
+      <w:r>
+        <w:rPr>
+          <w:rFonts w:ascii="Consolas" w:hAnsi="Consolas"/>
+          <w:color w:val="1E1E1E"/>
+          <w:sz w:val="18"/>
+          <w:shd w:val="clear" w:color="auto" w:fill="F2F2F2"/>
+        </w:rPr>
+        <w:t>from collections import deque</w:t>
+      </w:r>
+    </w:p>
+    <w:p>
+      <w:pPr>
+        <w:spacing w:before="0" w:after="0" w:line="240" w:lineRule="auto"/>
+      </w:pPr>
+      <w:r>
+        <w:rPr>
+          <w:rFonts w:ascii="Consolas" w:hAnsi="Consolas"/>
+          <w:color w:val="1E1E1E"/>
+          <w:sz w:val="18"/>
+          <w:shd w:val="clear" w:color="auto" w:fill="F2F2F2"/>
+        </w:rPr>
+      </w:r>
+    </w:p>
+    <w:p>
+      <w:pPr>
+        <w:spacing w:before="0" w:after="0" w:line="240" w:lineRule="auto"/>
+      </w:pPr>
+      <w:r>
+        <w:rPr>
+          <w:rFonts w:ascii="Consolas" w:hAnsi="Consolas"/>
+          <w:color w:val="1E1E1E"/>
+          <w:sz w:val="18"/>
+          <w:shd w:val="clear" w:color="auto" w:fill="F2F2F2"/>
+        </w:rPr>
       </w:r>
     </w:p>
     <w:p>
@@ -1511,7 +1689,35 @@
           <w:sz w:val="18"/>
           <w:shd w:val="clear" w:color="auto" w:fill="F2F2F2"/>
         </w:rPr>
-        <w:t xml:space="preserve">    added without changing this class.</w:t>
+        <w:t xml:space="preserve">    added without changing this class. It also supports a bounded queue mode for</w:t>
+      </w:r>
+    </w:p>
+    <w:p>
+      <w:pPr>
+        <w:spacing w:before="0" w:after="0" w:line="240" w:lineRule="auto"/>
+      </w:pPr>
+      <w:r>
+        <w:rPr>
+          <w:rFonts w:ascii="Consolas" w:hAnsi="Consolas"/>
+          <w:color w:val="1E1E1E"/>
+          <w:sz w:val="18"/>
+          <w:shd w:val="clear" w:color="auto" w:fill="F2F2F2"/>
+        </w:rPr>
+        <w:t xml:space="preserve">    flood scenarios; when a queue is full, the least important queued event is</w:t>
+      </w:r>
+    </w:p>
+    <w:p>
+      <w:pPr>
+        <w:spacing w:before="0" w:after="0" w:line="240" w:lineRule="auto"/>
+      </w:pPr>
+      <w:r>
+        <w:rPr>
+          <w:rFonts w:ascii="Consolas" w:hAnsi="Consolas"/>
+          <w:color w:val="1E1E1E"/>
+          <w:sz w:val="18"/>
+          <w:shd w:val="clear" w:color="auto" w:fill="F2F2F2"/>
+        </w:rPr>
+        <w:t xml:space="preserve">    evicted before a more important incoming event is accepted.</w:t>
       </w:r>
     </w:p>
     <w:p>
@@ -1552,7 +1758,118 @@
           <w:sz w:val="18"/>
           <w:shd w:val="clear" w:color="auto" w:fill="F2F2F2"/>
         </w:rPr>
-        <w:t xml:space="preserve">    def __init__(self):</w:t>
+        <w:t xml:space="preserve">    DEFAULT_EVENT_PRIORITIES = {</w:t>
+      </w:r>
+    </w:p>
+    <w:p>
+      <w:pPr>
+        <w:spacing w:before="0" w:after="0" w:line="240" w:lineRule="auto"/>
+      </w:pPr>
+      <w:r>
+        <w:rPr>
+          <w:rFonts w:ascii="Consolas" w:hAnsi="Consolas"/>
+          <w:color w:val="1E1E1E"/>
+          <w:sz w:val="18"/>
+          <w:shd w:val="clear" w:color="auto" w:fill="F2F2F2"/>
+        </w:rPr>
+        <w:t xml:space="preserve">        "VehicleDetectedEvent": 1,</w:t>
+      </w:r>
+    </w:p>
+    <w:p>
+      <w:pPr>
+        <w:spacing w:before="0" w:after="0" w:line="240" w:lineRule="auto"/>
+      </w:pPr>
+      <w:r>
+        <w:rPr>
+          <w:rFonts w:ascii="Consolas" w:hAnsi="Consolas"/>
+          <w:color w:val="1E1E1E"/>
+          <w:sz w:val="18"/>
+          <w:shd w:val="clear" w:color="auto" w:fill="F2F2F2"/>
+        </w:rPr>
+        <w:t xml:space="preserve">        "TrafficClearedEvent": 2,</w:t>
+      </w:r>
+    </w:p>
+    <w:p>
+      <w:pPr>
+        <w:spacing w:before="0" w:after="0" w:line="240" w:lineRule="auto"/>
+      </w:pPr>
+      <w:r>
+        <w:rPr>
+          <w:rFonts w:ascii="Consolas" w:hAnsi="Consolas"/>
+          <w:color w:val="1E1E1E"/>
+          <w:sz w:val="18"/>
+          <w:shd w:val="clear" w:color="auto" w:fill="F2F2F2"/>
+        </w:rPr>
+        <w:t xml:space="preserve">        "SpeedViolationEvent": 3,</w:t>
+      </w:r>
+    </w:p>
+    <w:p>
+      <w:pPr>
+        <w:spacing w:before="0" w:after="0" w:line="240" w:lineRule="auto"/>
+      </w:pPr>
+      <w:r>
+        <w:rPr>
+          <w:rFonts w:ascii="Consolas" w:hAnsi="Consolas"/>
+          <w:color w:val="1E1E1E"/>
+          <w:sz w:val="18"/>
+          <w:shd w:val="clear" w:color="auto" w:fill="F2F2F2"/>
+        </w:rPr>
+        <w:t xml:space="preserve">        "EmergencyVehicleEvent": 4,</w:t>
+      </w:r>
+    </w:p>
+    <w:p>
+      <w:pPr>
+        <w:spacing w:before="0" w:after="0" w:line="240" w:lineRule="auto"/>
+      </w:pPr>
+      <w:r>
+        <w:rPr>
+          <w:rFonts w:ascii="Consolas" w:hAnsi="Consolas"/>
+          <w:color w:val="1E1E1E"/>
+          <w:sz w:val="18"/>
+          <w:shd w:val="clear" w:color="auto" w:fill="F2F2F2"/>
+        </w:rPr>
+        <w:t xml:space="preserve">        "CongestionAlertEvent": 5,</w:t>
+      </w:r>
+    </w:p>
+    <w:p>
+      <w:pPr>
+        <w:spacing w:before="0" w:after="0" w:line="240" w:lineRule="auto"/>
+      </w:pPr>
+      <w:r>
+        <w:rPr>
+          <w:rFonts w:ascii="Consolas" w:hAnsi="Consolas"/>
+          <w:color w:val="1E1E1E"/>
+          <w:sz w:val="18"/>
+          <w:shd w:val="clear" w:color="auto" w:fill="F2F2F2"/>
+        </w:rPr>
+        <w:t xml:space="preserve">    }</w:t>
+      </w:r>
+    </w:p>
+    <w:p>
+      <w:pPr>
+        <w:spacing w:before="0" w:after="0" w:line="240" w:lineRule="auto"/>
+      </w:pPr>
+      <w:r>
+        <w:rPr>
+          <w:rFonts w:ascii="Consolas" w:hAnsi="Consolas"/>
+          <w:color w:val="1E1E1E"/>
+          <w:sz w:val="18"/>
+          <w:shd w:val="clear" w:color="auto" w:fill="F2F2F2"/>
+        </w:rPr>
+      </w:r>
+    </w:p>
+    <w:p>
+      <w:pPr>
+        <w:spacing w:before="0" w:after="0" w:line="240" w:lineRule="auto"/>
+      </w:pPr>
+      <w:r>
+        <w:rPr>
+          <w:rFonts w:ascii="Consolas" w:hAnsi="Consolas"/>
+          <w:color w:val="1E1E1E"/>
+          <w:sz w:val="18"/>
+          <w:shd w:val="clear" w:color="auto" w:fill="F2F2F2"/>
+        </w:rPr>
+        <w:t xml:space="preserve">    def __init__(self, max_queue_size=None, auto_flush=True, event_priorities=None):</w:t>
       </w:r>
     </w:p>
     <w:p>
@@ -1580,6 +1897,62 @@
           <w:sz w:val="18"/>
           <w:shd w:val="clear" w:color="auto" w:fill="F2F2F2"/>
         </w:rPr>
+        <w:t xml:space="preserve">        self._queues = {}</w:t>
+      </w:r>
+    </w:p>
+    <w:p>
+      <w:pPr>
+        <w:spacing w:before="0" w:after="0" w:line="240" w:lineRule="auto"/>
+      </w:pPr>
+      <w:r>
+        <w:rPr>
+          <w:rFonts w:ascii="Consolas" w:hAnsi="Consolas"/>
+          <w:color w:val="1E1E1E"/>
+          <w:sz w:val="18"/>
+          <w:shd w:val="clear" w:color="auto" w:fill="F2F2F2"/>
+        </w:rPr>
+        <w:t xml:space="preserve">        self.max_queue_size = max_queue_size</w:t>
+      </w:r>
+    </w:p>
+    <w:p>
+      <w:pPr>
+        <w:spacing w:before="0" w:after="0" w:line="240" w:lineRule="auto"/>
+      </w:pPr>
+      <w:r>
+        <w:rPr>
+          <w:rFonts w:ascii="Consolas" w:hAnsi="Consolas"/>
+          <w:color w:val="1E1E1E"/>
+          <w:sz w:val="18"/>
+          <w:shd w:val="clear" w:color="auto" w:fill="F2F2F2"/>
+        </w:rPr>
+        <w:t xml:space="preserve">        self.auto_flush = auto_flush</w:t>
+      </w:r>
+    </w:p>
+    <w:p>
+      <w:pPr>
+        <w:spacing w:before="0" w:after="0" w:line="240" w:lineRule="auto"/>
+      </w:pPr>
+      <w:r>
+        <w:rPr>
+          <w:rFonts w:ascii="Consolas" w:hAnsi="Consolas"/>
+          <w:color w:val="1E1E1E"/>
+          <w:sz w:val="18"/>
+          <w:shd w:val="clear" w:color="auto" w:fill="F2F2F2"/>
+        </w:rPr>
+        <w:t xml:space="preserve">        self.event_priorities = event_priorities or self.DEFAULT_EVENT_PRIORITIES</w:t>
+      </w:r>
+    </w:p>
+    <w:p>
+      <w:pPr>
+        <w:spacing w:before="0" w:after="0" w:line="240" w:lineRule="auto"/>
+      </w:pPr>
+      <w:r>
+        <w:rPr>
+          <w:rFonts w:ascii="Consolas" w:hAnsi="Consolas"/>
+          <w:color w:val="1E1E1E"/>
+          <w:sz w:val="18"/>
+          <w:shd w:val="clear" w:color="auto" w:fill="F2F2F2"/>
+        </w:rPr>
       </w:r>
     </w:p>
     <w:p>
@@ -1621,6 +1994,20 @@
           <w:sz w:val="18"/>
           <w:shd w:val="clear" w:color="auto" w:fill="F2F2F2"/>
         </w:rPr>
+        <w:t xml:space="preserve">        self._queues[subscriber] = deque()</w:t>
+      </w:r>
+    </w:p>
+    <w:p>
+      <w:pPr>
+        <w:spacing w:before="0" w:after="0" w:line="240" w:lineRule="auto"/>
+      </w:pPr>
+      <w:r>
+        <w:rPr>
+          <w:rFonts w:ascii="Consolas" w:hAnsi="Consolas"/>
+          <w:color w:val="1E1E1E"/>
+          <w:sz w:val="18"/>
+          <w:shd w:val="clear" w:color="auto" w:fill="F2F2F2"/>
+        </w:rPr>
       </w:r>
     </w:p>
     <w:p>
@@ -1676,6 +2063,20 @@
           <w:sz w:val="18"/>
           <w:shd w:val="clear" w:color="auto" w:fill="F2F2F2"/>
         </w:rPr>
+        <w:t xml:space="preserve">            self._queues.pop(subscriber, None)</w:t>
+      </w:r>
+    </w:p>
+    <w:p>
+      <w:pPr>
+        <w:spacing w:before="0" w:after="0" w:line="240" w:lineRule="auto"/>
+      </w:pPr>
+      <w:r>
+        <w:rPr>
+          <w:rFonts w:ascii="Consolas" w:hAnsi="Consolas"/>
+          <w:color w:val="1E1E1E"/>
+          <w:sz w:val="18"/>
+          <w:shd w:val="clear" w:color="auto" w:fill="F2F2F2"/>
+        </w:rPr>
       </w:r>
     </w:p>
     <w:p>
@@ -1703,7 +2104,7 @@
           <w:sz w:val="18"/>
           <w:shd w:val="clear" w:color="auto" w:fill="F2F2F2"/>
         </w:rPr>
-        <w:t xml:space="preserve">        print(f"EventBus delivering event: {envelope.event_type}")</w:t>
+        <w:t xml:space="preserve">        print(f"EventBus queued event: {envelope.event_type}")</w:t>
       </w:r>
     </w:p>
     <w:p>
@@ -1744,7 +2145,694 @@
           <w:sz w:val="18"/>
           <w:shd w:val="clear" w:color="auto" w:fill="F2F2F2"/>
         </w:rPr>
-        <w:t xml:space="preserve">            subscriber.on_event(envelope)</w:t>
+        <w:t xml:space="preserve">            self._enqueue(subscriber, envelope)</w:t>
+      </w:r>
+    </w:p>
+    <w:p>
+      <w:pPr>
+        <w:spacing w:before="0" w:after="0" w:line="240" w:lineRule="auto"/>
+      </w:pPr>
+      <w:r>
+        <w:rPr>
+          <w:rFonts w:ascii="Consolas" w:hAnsi="Consolas"/>
+          <w:color w:val="1E1E1E"/>
+          <w:sz w:val="18"/>
+          <w:shd w:val="clear" w:color="auto" w:fill="F2F2F2"/>
+        </w:rPr>
+      </w:r>
+    </w:p>
+    <w:p>
+      <w:pPr>
+        <w:spacing w:before="0" w:after="0" w:line="240" w:lineRule="auto"/>
+      </w:pPr>
+      <w:r>
+        <w:rPr>
+          <w:rFonts w:ascii="Consolas" w:hAnsi="Consolas"/>
+          <w:color w:val="1E1E1E"/>
+          <w:sz w:val="18"/>
+          <w:shd w:val="clear" w:color="auto" w:fill="F2F2F2"/>
+        </w:rPr>
+        <w:t xml:space="preserve">        if self.auto_flush:</w:t>
+      </w:r>
+    </w:p>
+    <w:p>
+      <w:pPr>
+        <w:spacing w:before="0" w:after="0" w:line="240" w:lineRule="auto"/>
+      </w:pPr>
+      <w:r>
+        <w:rPr>
+          <w:rFonts w:ascii="Consolas" w:hAnsi="Consolas"/>
+          <w:color w:val="1E1E1E"/>
+          <w:sz w:val="18"/>
+          <w:shd w:val="clear" w:color="auto" w:fill="F2F2F2"/>
+        </w:rPr>
+        <w:t xml:space="preserve">            self.flush()</w:t>
+      </w:r>
+    </w:p>
+    <w:p>
+      <w:pPr>
+        <w:spacing w:before="0" w:after="0" w:line="240" w:lineRule="auto"/>
+      </w:pPr>
+      <w:r>
+        <w:rPr>
+          <w:rFonts w:ascii="Consolas" w:hAnsi="Consolas"/>
+          <w:color w:val="1E1E1E"/>
+          <w:sz w:val="18"/>
+          <w:shd w:val="clear" w:color="auto" w:fill="F2F2F2"/>
+        </w:rPr>
+      </w:r>
+    </w:p>
+    <w:p>
+      <w:pPr>
+        <w:spacing w:before="0" w:after="0" w:line="240" w:lineRule="auto"/>
+      </w:pPr>
+      <w:r>
+        <w:rPr>
+          <w:rFonts w:ascii="Consolas" w:hAnsi="Consolas"/>
+          <w:color w:val="1E1E1E"/>
+          <w:sz w:val="18"/>
+          <w:shd w:val="clear" w:color="auto" w:fill="F2F2F2"/>
+        </w:rPr>
+        <w:t xml:space="preserve">    def flush(self, subscriber=None):</w:t>
+      </w:r>
+    </w:p>
+    <w:p>
+      <w:pPr>
+        <w:spacing w:before="0" w:after="0" w:line="240" w:lineRule="auto"/>
+      </w:pPr>
+      <w:r>
+        <w:rPr>
+          <w:rFonts w:ascii="Consolas" w:hAnsi="Consolas"/>
+          <w:color w:val="1E1E1E"/>
+          <w:sz w:val="18"/>
+          <w:shd w:val="clear" w:color="auto" w:fill="F2F2F2"/>
+        </w:rPr>
+        <w:t xml:space="preserve">        subscribers = [subscriber] if subscriber else list(self._subscribers)</w:t>
+      </w:r>
+    </w:p>
+    <w:p>
+      <w:pPr>
+        <w:spacing w:before="0" w:after="0" w:line="240" w:lineRule="auto"/>
+      </w:pPr>
+      <w:r>
+        <w:rPr>
+          <w:rFonts w:ascii="Consolas" w:hAnsi="Consolas"/>
+          <w:color w:val="1E1E1E"/>
+          <w:sz w:val="18"/>
+          <w:shd w:val="clear" w:color="auto" w:fill="F2F2F2"/>
+        </w:rPr>
+      </w:r>
+    </w:p>
+    <w:p>
+      <w:pPr>
+        <w:spacing w:before="0" w:after="0" w:line="240" w:lineRule="auto"/>
+      </w:pPr>
+      <w:r>
+        <w:rPr>
+          <w:rFonts w:ascii="Consolas" w:hAnsi="Consolas"/>
+          <w:color w:val="1E1E1E"/>
+          <w:sz w:val="18"/>
+          <w:shd w:val="clear" w:color="auto" w:fill="F2F2F2"/>
+        </w:rPr>
+        <w:t xml:space="preserve">        for current_subscriber in subscribers:</w:t>
+      </w:r>
+    </w:p>
+    <w:p>
+      <w:pPr>
+        <w:spacing w:before="0" w:after="0" w:line="240" w:lineRule="auto"/>
+      </w:pPr>
+      <w:r>
+        <w:rPr>
+          <w:rFonts w:ascii="Consolas" w:hAnsi="Consolas"/>
+          <w:color w:val="1E1E1E"/>
+          <w:sz w:val="18"/>
+          <w:shd w:val="clear" w:color="auto" w:fill="F2F2F2"/>
+        </w:rPr>
+        <w:t xml:space="preserve">            queue = self._queues.get(current_subscriber)</w:t>
+      </w:r>
+    </w:p>
+    <w:p>
+      <w:pPr>
+        <w:spacing w:before="0" w:after="0" w:line="240" w:lineRule="auto"/>
+      </w:pPr>
+      <w:r>
+        <w:rPr>
+          <w:rFonts w:ascii="Consolas" w:hAnsi="Consolas"/>
+          <w:color w:val="1E1E1E"/>
+          <w:sz w:val="18"/>
+          <w:shd w:val="clear" w:color="auto" w:fill="F2F2F2"/>
+        </w:rPr>
+        <w:t xml:space="preserve">            if queue is None:</w:t>
+      </w:r>
+    </w:p>
+    <w:p>
+      <w:pPr>
+        <w:spacing w:before="0" w:after="0" w:line="240" w:lineRule="auto"/>
+      </w:pPr>
+      <w:r>
+        <w:rPr>
+          <w:rFonts w:ascii="Consolas" w:hAnsi="Consolas"/>
+          <w:color w:val="1E1E1E"/>
+          <w:sz w:val="18"/>
+          <w:shd w:val="clear" w:color="auto" w:fill="F2F2F2"/>
+        </w:rPr>
+        <w:t xml:space="preserve">                continue</w:t>
+      </w:r>
+    </w:p>
+    <w:p>
+      <w:pPr>
+        <w:spacing w:before="0" w:after="0" w:line="240" w:lineRule="auto"/>
+      </w:pPr>
+      <w:r>
+        <w:rPr>
+          <w:rFonts w:ascii="Consolas" w:hAnsi="Consolas"/>
+          <w:color w:val="1E1E1E"/>
+          <w:sz w:val="18"/>
+          <w:shd w:val="clear" w:color="auto" w:fill="F2F2F2"/>
+        </w:rPr>
+      </w:r>
+    </w:p>
+    <w:p>
+      <w:pPr>
+        <w:spacing w:before="0" w:after="0" w:line="240" w:lineRule="auto"/>
+      </w:pPr>
+      <w:r>
+        <w:rPr>
+          <w:rFonts w:ascii="Consolas" w:hAnsi="Consolas"/>
+          <w:color w:val="1E1E1E"/>
+          <w:sz w:val="18"/>
+          <w:shd w:val="clear" w:color="auto" w:fill="F2F2F2"/>
+        </w:rPr>
+        <w:t xml:space="preserve">            while queue:</w:t>
+      </w:r>
+    </w:p>
+    <w:p>
+      <w:pPr>
+        <w:spacing w:before="0" w:after="0" w:line="240" w:lineRule="auto"/>
+      </w:pPr>
+      <w:r>
+        <w:rPr>
+          <w:rFonts w:ascii="Consolas" w:hAnsi="Consolas"/>
+          <w:color w:val="1E1E1E"/>
+          <w:sz w:val="18"/>
+          <w:shd w:val="clear" w:color="auto" w:fill="F2F2F2"/>
+        </w:rPr>
+        <w:t xml:space="preserve">                envelope = queue.popleft()</w:t>
+      </w:r>
+    </w:p>
+    <w:p>
+      <w:pPr>
+        <w:spacing w:before="0" w:after="0" w:line="240" w:lineRule="auto"/>
+      </w:pPr>
+      <w:r>
+        <w:rPr>
+          <w:rFonts w:ascii="Consolas" w:hAnsi="Consolas"/>
+          <w:color w:val="1E1E1E"/>
+          <w:sz w:val="18"/>
+          <w:shd w:val="clear" w:color="auto" w:fill="F2F2F2"/>
+        </w:rPr>
+        <w:t xml:space="preserve">                print(f"EventBus delivering event: {envelope.event_type}")</w:t>
+      </w:r>
+    </w:p>
+    <w:p>
+      <w:pPr>
+        <w:spacing w:before="0" w:after="0" w:line="240" w:lineRule="auto"/>
+      </w:pPr>
+      <w:r>
+        <w:rPr>
+          <w:rFonts w:ascii="Consolas" w:hAnsi="Consolas"/>
+          <w:color w:val="1E1E1E"/>
+          <w:sz w:val="18"/>
+          <w:shd w:val="clear" w:color="auto" w:fill="F2F2F2"/>
+        </w:rPr>
+        <w:t xml:space="preserve">                current_subscriber.on_event(envelope)</w:t>
+      </w:r>
+    </w:p>
+    <w:p>
+      <w:pPr>
+        <w:spacing w:before="0" w:after="0" w:line="240" w:lineRule="auto"/>
+      </w:pPr>
+      <w:r>
+        <w:rPr>
+          <w:rFonts w:ascii="Consolas" w:hAnsi="Consolas"/>
+          <w:color w:val="1E1E1E"/>
+          <w:sz w:val="18"/>
+          <w:shd w:val="clear" w:color="auto" w:fill="F2F2F2"/>
+        </w:rPr>
+      </w:r>
+    </w:p>
+    <w:p>
+      <w:pPr>
+        <w:spacing w:before="0" w:after="0" w:line="240" w:lineRule="auto"/>
+      </w:pPr>
+      <w:r>
+        <w:rPr>
+          <w:rFonts w:ascii="Consolas" w:hAnsi="Consolas"/>
+          <w:color w:val="1E1E1E"/>
+          <w:sz w:val="18"/>
+          <w:shd w:val="clear" w:color="auto" w:fill="F2F2F2"/>
+        </w:rPr>
+        <w:t xml:space="preserve">    def pending_count(self, subscriber):</w:t>
+      </w:r>
+    </w:p>
+    <w:p>
+      <w:pPr>
+        <w:spacing w:before="0" w:after="0" w:line="240" w:lineRule="auto"/>
+      </w:pPr>
+      <w:r>
+        <w:rPr>
+          <w:rFonts w:ascii="Consolas" w:hAnsi="Consolas"/>
+          <w:color w:val="1E1E1E"/>
+          <w:sz w:val="18"/>
+          <w:shd w:val="clear" w:color="auto" w:fill="F2F2F2"/>
+        </w:rPr>
+        <w:t xml:space="preserve">        return len(self._queues.get(subscriber, ()))</w:t>
+      </w:r>
+    </w:p>
+    <w:p>
+      <w:pPr>
+        <w:spacing w:before="0" w:after="0" w:line="240" w:lineRule="auto"/>
+      </w:pPr>
+      <w:r>
+        <w:rPr>
+          <w:rFonts w:ascii="Consolas" w:hAnsi="Consolas"/>
+          <w:color w:val="1E1E1E"/>
+          <w:sz w:val="18"/>
+          <w:shd w:val="clear" w:color="auto" w:fill="F2F2F2"/>
+        </w:rPr>
+      </w:r>
+    </w:p>
+    <w:p>
+      <w:pPr>
+        <w:spacing w:before="0" w:after="0" w:line="240" w:lineRule="auto"/>
+      </w:pPr>
+      <w:r>
+        <w:rPr>
+          <w:rFonts w:ascii="Consolas" w:hAnsi="Consolas"/>
+          <w:color w:val="1E1E1E"/>
+          <w:sz w:val="18"/>
+          <w:shd w:val="clear" w:color="auto" w:fill="F2F2F2"/>
+        </w:rPr>
+        <w:t xml:space="preserve">    def _enqueue(self, subscriber, envelope):</w:t>
+      </w:r>
+    </w:p>
+    <w:p>
+      <w:pPr>
+        <w:spacing w:before="0" w:after="0" w:line="240" w:lineRule="auto"/>
+      </w:pPr>
+      <w:r>
+        <w:rPr>
+          <w:rFonts w:ascii="Consolas" w:hAnsi="Consolas"/>
+          <w:color w:val="1E1E1E"/>
+          <w:sz w:val="18"/>
+          <w:shd w:val="clear" w:color="auto" w:fill="F2F2F2"/>
+        </w:rPr>
+        <w:t xml:space="preserve">        queue = self._queues[subscriber]</w:t>
+      </w:r>
+    </w:p>
+    <w:p>
+      <w:pPr>
+        <w:spacing w:before="0" w:after="0" w:line="240" w:lineRule="auto"/>
+      </w:pPr>
+      <w:r>
+        <w:rPr>
+          <w:rFonts w:ascii="Consolas" w:hAnsi="Consolas"/>
+          <w:color w:val="1E1E1E"/>
+          <w:sz w:val="18"/>
+          <w:shd w:val="clear" w:color="auto" w:fill="F2F2F2"/>
+        </w:rPr>
+      </w:r>
+    </w:p>
+    <w:p>
+      <w:pPr>
+        <w:spacing w:before="0" w:after="0" w:line="240" w:lineRule="auto"/>
+      </w:pPr>
+      <w:r>
+        <w:rPr>
+          <w:rFonts w:ascii="Consolas" w:hAnsi="Consolas"/>
+          <w:color w:val="1E1E1E"/>
+          <w:sz w:val="18"/>
+          <w:shd w:val="clear" w:color="auto" w:fill="F2F2F2"/>
+        </w:rPr>
+        <w:t xml:space="preserve">        if self.max_queue_size is None or len(queue) &lt; self.max_queue_size:</w:t>
+      </w:r>
+    </w:p>
+    <w:p>
+      <w:pPr>
+        <w:spacing w:before="0" w:after="0" w:line="240" w:lineRule="auto"/>
+      </w:pPr>
+      <w:r>
+        <w:rPr>
+          <w:rFonts w:ascii="Consolas" w:hAnsi="Consolas"/>
+          <w:color w:val="1E1E1E"/>
+          <w:sz w:val="18"/>
+          <w:shd w:val="clear" w:color="auto" w:fill="F2F2F2"/>
+        </w:rPr>
+        <w:t xml:space="preserve">            queue.append(envelope)</w:t>
+      </w:r>
+    </w:p>
+    <w:p>
+      <w:pPr>
+        <w:spacing w:before="0" w:after="0" w:line="240" w:lineRule="auto"/>
+      </w:pPr>
+      <w:r>
+        <w:rPr>
+          <w:rFonts w:ascii="Consolas" w:hAnsi="Consolas"/>
+          <w:color w:val="1E1E1E"/>
+          <w:sz w:val="18"/>
+          <w:shd w:val="clear" w:color="auto" w:fill="F2F2F2"/>
+        </w:rPr>
+        <w:t xml:space="preserve">            return</w:t>
+      </w:r>
+    </w:p>
+    <w:p>
+      <w:pPr>
+        <w:spacing w:before="0" w:after="0" w:line="240" w:lineRule="auto"/>
+      </w:pPr>
+      <w:r>
+        <w:rPr>
+          <w:rFonts w:ascii="Consolas" w:hAnsi="Consolas"/>
+          <w:color w:val="1E1E1E"/>
+          <w:sz w:val="18"/>
+          <w:shd w:val="clear" w:color="auto" w:fill="F2F2F2"/>
+        </w:rPr>
+      </w:r>
+    </w:p>
+    <w:p>
+      <w:pPr>
+        <w:spacing w:before="0" w:after="0" w:line="240" w:lineRule="auto"/>
+      </w:pPr>
+      <w:r>
+        <w:rPr>
+          <w:rFonts w:ascii="Consolas" w:hAnsi="Consolas"/>
+          <w:color w:val="1E1E1E"/>
+          <w:sz w:val="18"/>
+          <w:shd w:val="clear" w:color="auto" w:fill="F2F2F2"/>
+        </w:rPr>
+        <w:t xml:space="preserve">        lowest_index, lowest_priority = self._least_important_queued_event(queue)</w:t>
+      </w:r>
+    </w:p>
+    <w:p>
+      <w:pPr>
+        <w:spacing w:before="0" w:after="0" w:line="240" w:lineRule="auto"/>
+      </w:pPr>
+      <w:r>
+        <w:rPr>
+          <w:rFonts w:ascii="Consolas" w:hAnsi="Consolas"/>
+          <w:color w:val="1E1E1E"/>
+          <w:sz w:val="18"/>
+          <w:shd w:val="clear" w:color="auto" w:fill="F2F2F2"/>
+        </w:rPr>
+        <w:t xml:space="preserve">        incoming_priority = self._priority(envelope)</w:t>
+      </w:r>
+    </w:p>
+    <w:p>
+      <w:pPr>
+        <w:spacing w:before="0" w:after="0" w:line="240" w:lineRule="auto"/>
+      </w:pPr>
+      <w:r>
+        <w:rPr>
+          <w:rFonts w:ascii="Consolas" w:hAnsi="Consolas"/>
+          <w:color w:val="1E1E1E"/>
+          <w:sz w:val="18"/>
+          <w:shd w:val="clear" w:color="auto" w:fill="F2F2F2"/>
+        </w:rPr>
+      </w:r>
+    </w:p>
+    <w:p>
+      <w:pPr>
+        <w:spacing w:before="0" w:after="0" w:line="240" w:lineRule="auto"/>
+      </w:pPr>
+      <w:r>
+        <w:rPr>
+          <w:rFonts w:ascii="Consolas" w:hAnsi="Consolas"/>
+          <w:color w:val="1E1E1E"/>
+          <w:sz w:val="18"/>
+          <w:shd w:val="clear" w:color="auto" w:fill="F2F2F2"/>
+        </w:rPr>
+        <w:t xml:space="preserve">        if incoming_priority &gt;= lowest_priority:</w:t>
+      </w:r>
+    </w:p>
+    <w:p>
+      <w:pPr>
+        <w:spacing w:before="0" w:after="0" w:line="240" w:lineRule="auto"/>
+      </w:pPr>
+      <w:r>
+        <w:rPr>
+          <w:rFonts w:ascii="Consolas" w:hAnsi="Consolas"/>
+          <w:color w:val="1E1E1E"/>
+          <w:sz w:val="18"/>
+          <w:shd w:val="clear" w:color="auto" w:fill="F2F2F2"/>
+        </w:rPr>
+        <w:t xml:space="preserve">            del queue[lowest_index]</w:t>
+      </w:r>
+    </w:p>
+    <w:p>
+      <w:pPr>
+        <w:spacing w:before="0" w:after="0" w:line="240" w:lineRule="auto"/>
+      </w:pPr>
+      <w:r>
+        <w:rPr>
+          <w:rFonts w:ascii="Consolas" w:hAnsi="Consolas"/>
+          <w:color w:val="1E1E1E"/>
+          <w:sz w:val="18"/>
+          <w:shd w:val="clear" w:color="auto" w:fill="F2F2F2"/>
+        </w:rPr>
+        <w:t xml:space="preserve">            queue.append(envelope)</w:t>
+      </w:r>
+    </w:p>
+    <w:p>
+      <w:pPr>
+        <w:spacing w:before="0" w:after="0" w:line="240" w:lineRule="auto"/>
+      </w:pPr>
+      <w:r>
+        <w:rPr>
+          <w:rFonts w:ascii="Consolas" w:hAnsi="Consolas"/>
+          <w:color w:val="1E1E1E"/>
+          <w:sz w:val="18"/>
+          <w:shd w:val="clear" w:color="auto" w:fill="F2F2F2"/>
+        </w:rPr>
+        <w:t xml:space="preserve">        else:</w:t>
+      </w:r>
+    </w:p>
+    <w:p>
+      <w:pPr>
+        <w:spacing w:before="0" w:after="0" w:line="240" w:lineRule="auto"/>
+      </w:pPr>
+      <w:r>
+        <w:rPr>
+          <w:rFonts w:ascii="Consolas" w:hAnsi="Consolas"/>
+          <w:color w:val="1E1E1E"/>
+          <w:sz w:val="18"/>
+          <w:shd w:val="clear" w:color="auto" w:fill="F2F2F2"/>
+        </w:rPr>
+        <w:t xml:space="preserve">            print(f"EventBus dropped low-priority event: {envelope.event_type}")</w:t>
+      </w:r>
+    </w:p>
+    <w:p>
+      <w:pPr>
+        <w:spacing w:before="0" w:after="0" w:line="240" w:lineRule="auto"/>
+      </w:pPr>
+      <w:r>
+        <w:rPr>
+          <w:rFonts w:ascii="Consolas" w:hAnsi="Consolas"/>
+          <w:color w:val="1E1E1E"/>
+          <w:sz w:val="18"/>
+          <w:shd w:val="clear" w:color="auto" w:fill="F2F2F2"/>
+        </w:rPr>
+      </w:r>
+    </w:p>
+    <w:p>
+      <w:pPr>
+        <w:spacing w:before="0" w:after="0" w:line="240" w:lineRule="auto"/>
+      </w:pPr>
+      <w:r>
+        <w:rPr>
+          <w:rFonts w:ascii="Consolas" w:hAnsi="Consolas"/>
+          <w:color w:val="1E1E1E"/>
+          <w:sz w:val="18"/>
+          <w:shd w:val="clear" w:color="auto" w:fill="F2F2F2"/>
+        </w:rPr>
+        <w:t xml:space="preserve">    def _least_important_queued_event(self, queue):</w:t>
+      </w:r>
+    </w:p>
+    <w:p>
+      <w:pPr>
+        <w:spacing w:before="0" w:after="0" w:line="240" w:lineRule="auto"/>
+      </w:pPr>
+      <w:r>
+        <w:rPr>
+          <w:rFonts w:ascii="Consolas" w:hAnsi="Consolas"/>
+          <w:color w:val="1E1E1E"/>
+          <w:sz w:val="18"/>
+          <w:shd w:val="clear" w:color="auto" w:fill="F2F2F2"/>
+        </w:rPr>
+        <w:t xml:space="preserve">        lowest_index = 0</w:t>
+      </w:r>
+    </w:p>
+    <w:p>
+      <w:pPr>
+        <w:spacing w:before="0" w:after="0" w:line="240" w:lineRule="auto"/>
+      </w:pPr>
+      <w:r>
+        <w:rPr>
+          <w:rFonts w:ascii="Consolas" w:hAnsi="Consolas"/>
+          <w:color w:val="1E1E1E"/>
+          <w:sz w:val="18"/>
+          <w:shd w:val="clear" w:color="auto" w:fill="F2F2F2"/>
+        </w:rPr>
+        <w:t xml:space="preserve">        lowest_priority = self._priority(queue[0])</w:t>
+      </w:r>
+    </w:p>
+    <w:p>
+      <w:pPr>
+        <w:spacing w:before="0" w:after="0" w:line="240" w:lineRule="auto"/>
+      </w:pPr>
+      <w:r>
+        <w:rPr>
+          <w:rFonts w:ascii="Consolas" w:hAnsi="Consolas"/>
+          <w:color w:val="1E1E1E"/>
+          <w:sz w:val="18"/>
+          <w:shd w:val="clear" w:color="auto" w:fill="F2F2F2"/>
+        </w:rPr>
+      </w:r>
+    </w:p>
+    <w:p>
+      <w:pPr>
+        <w:spacing w:before="0" w:after="0" w:line="240" w:lineRule="auto"/>
+      </w:pPr>
+      <w:r>
+        <w:rPr>
+          <w:rFonts w:ascii="Consolas" w:hAnsi="Consolas"/>
+          <w:color w:val="1E1E1E"/>
+          <w:sz w:val="18"/>
+          <w:shd w:val="clear" w:color="auto" w:fill="F2F2F2"/>
+        </w:rPr>
+        <w:t xml:space="preserve">        for index, queued_envelope in enumerate(queue):</w:t>
+      </w:r>
+    </w:p>
+    <w:p>
+      <w:pPr>
+        <w:spacing w:before="0" w:after="0" w:line="240" w:lineRule="auto"/>
+      </w:pPr>
+      <w:r>
+        <w:rPr>
+          <w:rFonts w:ascii="Consolas" w:hAnsi="Consolas"/>
+          <w:color w:val="1E1E1E"/>
+          <w:sz w:val="18"/>
+          <w:shd w:val="clear" w:color="auto" w:fill="F2F2F2"/>
+        </w:rPr>
+        <w:t xml:space="preserve">            priority = self._priority(queued_envelope)</w:t>
+      </w:r>
+    </w:p>
+    <w:p>
+      <w:pPr>
+        <w:spacing w:before="0" w:after="0" w:line="240" w:lineRule="auto"/>
+      </w:pPr>
+      <w:r>
+        <w:rPr>
+          <w:rFonts w:ascii="Consolas" w:hAnsi="Consolas"/>
+          <w:color w:val="1E1E1E"/>
+          <w:sz w:val="18"/>
+          <w:shd w:val="clear" w:color="auto" w:fill="F2F2F2"/>
+        </w:rPr>
+        <w:t xml:space="preserve">            if priority &lt; lowest_priority:</w:t>
+      </w:r>
+    </w:p>
+    <w:p>
+      <w:pPr>
+        <w:spacing w:before="0" w:after="0" w:line="240" w:lineRule="auto"/>
+      </w:pPr>
+      <w:r>
+        <w:rPr>
+          <w:rFonts w:ascii="Consolas" w:hAnsi="Consolas"/>
+          <w:color w:val="1E1E1E"/>
+          <w:sz w:val="18"/>
+          <w:shd w:val="clear" w:color="auto" w:fill="F2F2F2"/>
+        </w:rPr>
+        <w:t xml:space="preserve">                lowest_index = index</w:t>
+      </w:r>
+    </w:p>
+    <w:p>
+      <w:pPr>
+        <w:spacing w:before="0" w:after="0" w:line="240" w:lineRule="auto"/>
+      </w:pPr>
+      <w:r>
+        <w:rPr>
+          <w:rFonts w:ascii="Consolas" w:hAnsi="Consolas"/>
+          <w:color w:val="1E1E1E"/>
+          <w:sz w:val="18"/>
+          <w:shd w:val="clear" w:color="auto" w:fill="F2F2F2"/>
+        </w:rPr>
+        <w:t xml:space="preserve">                lowest_priority = priority</w:t>
+      </w:r>
+    </w:p>
+    <w:p>
+      <w:pPr>
+        <w:spacing w:before="0" w:after="0" w:line="240" w:lineRule="auto"/>
+      </w:pPr>
+      <w:r>
+        <w:rPr>
+          <w:rFonts w:ascii="Consolas" w:hAnsi="Consolas"/>
+          <w:color w:val="1E1E1E"/>
+          <w:sz w:val="18"/>
+          <w:shd w:val="clear" w:color="auto" w:fill="F2F2F2"/>
+        </w:rPr>
+      </w:r>
+    </w:p>
+    <w:p>
+      <w:pPr>
+        <w:spacing w:before="0" w:after="0" w:line="240" w:lineRule="auto"/>
+      </w:pPr>
+      <w:r>
+        <w:rPr>
+          <w:rFonts w:ascii="Consolas" w:hAnsi="Consolas"/>
+          <w:color w:val="1E1E1E"/>
+          <w:sz w:val="18"/>
+          <w:shd w:val="clear" w:color="auto" w:fill="F2F2F2"/>
+        </w:rPr>
+        <w:t xml:space="preserve">        return lowest_index, lowest_priority</w:t>
+      </w:r>
+    </w:p>
+    <w:p>
+      <w:pPr>
+        <w:spacing w:before="0" w:after="0" w:line="240" w:lineRule="auto"/>
+      </w:pPr>
+      <w:r>
+        <w:rPr>
+          <w:rFonts w:ascii="Consolas" w:hAnsi="Consolas"/>
+          <w:color w:val="1E1E1E"/>
+          <w:sz w:val="18"/>
+          <w:shd w:val="clear" w:color="auto" w:fill="F2F2F2"/>
+        </w:rPr>
+      </w:r>
+    </w:p>
+    <w:p>
+      <w:pPr>
+        <w:spacing w:before="0" w:after="0" w:line="240" w:lineRule="auto"/>
+      </w:pPr>
+      <w:r>
+        <w:rPr>
+          <w:rFonts w:ascii="Consolas" w:hAnsi="Consolas"/>
+          <w:color w:val="1E1E1E"/>
+          <w:sz w:val="18"/>
+          <w:shd w:val="clear" w:color="auto" w:fill="F2F2F2"/>
+        </w:rPr>
+        <w:t xml:space="preserve">    def _priority(self, envelope):</w:t>
+      </w:r>
+    </w:p>
+    <w:p>
+      <w:pPr>
+        <w:spacing w:before="0" w:after="0" w:line="240" w:lineRule="auto"/>
+      </w:pPr>
+      <w:r>
+        <w:rPr>
+          <w:rFonts w:ascii="Consolas" w:hAnsi="Consolas"/>
+          <w:color w:val="1E1E1E"/>
+          <w:sz w:val="18"/>
+          <w:shd w:val="clear" w:color="auto" w:fill="F2F2F2"/>
+        </w:rPr>
+        <w:t xml:space="preserve">        return self.event_priorities.get(envelope.event_type, 1)</w:t>
       </w:r>
     </w:p>
     <w:p>
@@ -1769,7 +2857,7 @@
           <w:rFonts w:ascii="Times New Roman" w:hAnsi="Times New Roman"/>
           <w:sz w:val="24"/>
         </w:rPr>
-        <w:t>This module defines five classes. IEventSubscriber is the abstract interface that all subscribers implement. AlertService and LoggingService extend IdempotentReceiver for duplicate protection. DashboardService handles real-time display updates. ReportingService collects data for periodic reporting. Each service processes only the event types relevant to its domain responsibility.</w:t>
+        <w:t>This module defines five classes. IEventSubscriber is the abstract interface that all subscribers implement. AlertService, LoggingService, DashboardService, and ReportingService all extend IdempotentReceiver, so every subscriber checks event_id and ignores duplicates before processing. Each service processes only the event types relevant to its domain responsibility.</w:t>
       </w:r>
     </w:p>
     <w:p>
@@ -2347,7 +3435,7 @@
           <w:sz w:val="18"/>
           <w:shd w:val="clear" w:color="auto" w:fill="F2F2F2"/>
         </w:rPr>
-        <w:t xml:space="preserve">                f"(limit {envelope.payload.speed_limit} km/h) — "</w:t>
+        <w:t xml:space="preserve">                f"(limit {envelope.payload.speed_limit} km/h) - "</w:t>
       </w:r>
     </w:p>
     <w:p>
@@ -2732,7 +3820,7 @@
           <w:sz w:val="18"/>
           <w:shd w:val="clear" w:color="auto" w:fill="F2F2F2"/>
         </w:rPr>
-        <w:t>class DashboardService(IEventSubscriber):</w:t>
+        <w:t>class DashboardService(IdempotentReceiver, IEventSubscriber):</w:t>
       </w:r>
     </w:p>
     <w:p>
@@ -2828,7 +3916,62 @@
           <w:sz w:val="18"/>
           <w:shd w:val="clear" w:color="auto" w:fill="F2F2F2"/>
         </w:rPr>
-        <w:t xml:space="preserve">    def on_event(self, envelope):</w:t>
+        <w:t xml:space="preserve">    def __init__(self):</w:t>
+      </w:r>
+    </w:p>
+    <w:p>
+      <w:pPr>
+        <w:spacing w:before="0" w:after="0" w:line="240" w:lineRule="auto"/>
+      </w:pPr>
+      <w:r>
+        <w:rPr>
+          <w:rFonts w:ascii="Consolas" w:hAnsi="Consolas"/>
+          <w:color w:val="1E1E1E"/>
+          <w:sz w:val="18"/>
+          <w:shd w:val="clear" w:color="auto" w:fill="F2F2F2"/>
+        </w:rPr>
+        <w:t xml:space="preserve">        super().__init__()</w:t>
+      </w:r>
+    </w:p>
+    <w:p>
+      <w:pPr>
+        <w:spacing w:before="0" w:after="0" w:line="240" w:lineRule="auto"/>
+      </w:pPr>
+      <w:r>
+        <w:rPr>
+          <w:rFonts w:ascii="Consolas" w:hAnsi="Consolas"/>
+          <w:color w:val="1E1E1E"/>
+          <w:sz w:val="18"/>
+          <w:shd w:val="clear" w:color="auto" w:fill="F2F2F2"/>
+        </w:rPr>
+        <w:t xml:space="preserve">        self.updates = []</w:t>
+      </w:r>
+    </w:p>
+    <w:p>
+      <w:pPr>
+        <w:spacing w:before="0" w:after="0" w:line="240" w:lineRule="auto"/>
+      </w:pPr>
+      <w:r>
+        <w:rPr>
+          <w:rFonts w:ascii="Consolas" w:hAnsi="Consolas"/>
+          <w:color w:val="1E1E1E"/>
+          <w:sz w:val="18"/>
+          <w:shd w:val="clear" w:color="auto" w:fill="F2F2F2"/>
+        </w:rPr>
+      </w:r>
+    </w:p>
+    <w:p>
+      <w:pPr>
+        <w:spacing w:before="0" w:after="0" w:line="240" w:lineRule="auto"/>
+      </w:pPr>
+      <w:r>
+        <w:rPr>
+          <w:rFonts w:ascii="Consolas" w:hAnsi="Consolas"/>
+          <w:color w:val="1E1E1E"/>
+          <w:sz w:val="18"/>
+          <w:shd w:val="clear" w:color="auto" w:fill="F2F2F2"/>
+        </w:rPr>
+        <w:t xml:space="preserve">    def process_event(self, envelope):</w:t>
       </w:r>
     </w:p>
     <w:p>
@@ -2883,6 +4026,34 @@
           <w:sz w:val="18"/>
           <w:shd w:val="clear" w:color="auto" w:fill="F2F2F2"/>
         </w:rPr>
+        <w:t xml:space="preserve">            self.updates.append(payload)</w:t>
+      </w:r>
+    </w:p>
+    <w:p>
+      <w:pPr>
+        <w:spacing w:before="0" w:after="0" w:line="240" w:lineRule="auto"/>
+      </w:pPr>
+      <w:r>
+        <w:rPr>
+          <w:rFonts w:ascii="Consolas" w:hAnsi="Consolas"/>
+          <w:color w:val="1E1E1E"/>
+          <w:sz w:val="18"/>
+          <w:shd w:val="clear" w:color="auto" w:fill="F2F2F2"/>
+        </w:rPr>
+        <w:t xml:space="preserve">            lane = payload.lane_number if payload.lane_number is not None else "unknown"</w:t>
+      </w:r>
+    </w:p>
+    <w:p>
+      <w:pPr>
+        <w:spacing w:before="0" w:after="0" w:line="240" w:lineRule="auto"/>
+      </w:pPr>
+      <w:r>
+        <w:rPr>
+          <w:rFonts w:ascii="Consolas" w:hAnsi="Consolas"/>
+          <w:color w:val="1E1E1E"/>
+          <w:sz w:val="18"/>
+          <w:shd w:val="clear" w:color="auto" w:fill="F2F2F2"/>
+        </w:rPr>
         <w:t xml:space="preserve">            print(</w:t>
       </w:r>
     </w:p>
@@ -2897,21 +4068,21 @@
           <w:sz w:val="18"/>
           <w:shd w:val="clear" w:color="auto" w:fill="F2F2F2"/>
         </w:rPr>
-        <w:t xml:space="preserve">                f"[DASHBOARD] Vehicle detected — Plate: {payload.plate_number} | "</w:t>
-      </w:r>
-    </w:p>
-    <w:p>
-      <w:pPr>
-        <w:spacing w:before="0" w:after="0" w:line="240" w:lineRule="auto"/>
-      </w:pPr>
-      <w:r>
-        <w:rPr>
-          <w:rFonts w:ascii="Consolas" w:hAnsi="Consolas"/>
-          <w:color w:val="1E1E1E"/>
-          <w:sz w:val="18"/>
-          <w:shd w:val="clear" w:color="auto" w:fill="F2F2F2"/>
-        </w:rPr>
-        <w:t xml:space="preserve">                f"Camera: {payload.camera_id} | Lane: {payload.lane_number}"</w:t>
+        <w:t xml:space="preserve">                f"[DASHBOARD] Vehicle detected - Plate: {payload.plate_number} | "</w:t>
+      </w:r>
+    </w:p>
+    <w:p>
+      <w:pPr>
+        <w:spacing w:before="0" w:after="0" w:line="240" w:lineRule="auto"/>
+      </w:pPr>
+      <w:r>
+        <w:rPr>
+          <w:rFonts w:ascii="Consolas" w:hAnsi="Consolas"/>
+          <w:color w:val="1E1E1E"/>
+          <w:sz w:val="18"/>
+          <w:shd w:val="clear" w:color="auto" w:fill="F2F2F2"/>
+        </w:rPr>
+        <w:t xml:space="preserve">                f"Camera: {payload.camera_id} | Lane: {lane}"</w:t>
       </w:r>
     </w:p>
     <w:p>
@@ -2966,6 +4137,20 @@
           <w:sz w:val="18"/>
           <w:shd w:val="clear" w:color="auto" w:fill="F2F2F2"/>
         </w:rPr>
+        <w:t xml:space="preserve">            self.updates.append(payload)</w:t>
+      </w:r>
+    </w:p>
+    <w:p>
+      <w:pPr>
+        <w:spacing w:before="0" w:after="0" w:line="240" w:lineRule="auto"/>
+      </w:pPr>
+      <w:r>
+        <w:rPr>
+          <w:rFonts w:ascii="Consolas" w:hAnsi="Consolas"/>
+          <w:color w:val="1E1E1E"/>
+          <w:sz w:val="18"/>
+          <w:shd w:val="clear" w:color="auto" w:fill="F2F2F2"/>
+        </w:rPr>
         <w:t xml:space="preserve">            print(</w:t>
       </w:r>
     </w:p>
@@ -2980,7 +4165,7 @@
           <w:sz w:val="18"/>
           <w:shd w:val="clear" w:color="auto" w:fill="F2F2F2"/>
         </w:rPr>
-        <w:t xml:space="preserve">                f"[DASHBOARD] Congestion alert — Intersection: {payload.intersection_id} | "</w:t>
+        <w:t xml:space="preserve">                f"[DASHBOARD] Congestion alert - Intersection: {payload.intersection_id} | "</w:t>
       </w:r>
     </w:p>
     <w:p>
@@ -3049,6 +4234,20 @@
           <w:sz w:val="18"/>
           <w:shd w:val="clear" w:color="auto" w:fill="F2F2F2"/>
         </w:rPr>
+        <w:t xml:space="preserve">            self.updates.append(payload)</w:t>
+      </w:r>
+    </w:p>
+    <w:p>
+      <w:pPr>
+        <w:spacing w:before="0" w:after="0" w:line="240" w:lineRule="auto"/>
+      </w:pPr>
+      <w:r>
+        <w:rPr>
+          <w:rFonts w:ascii="Consolas" w:hAnsi="Consolas"/>
+          <w:color w:val="1E1E1E"/>
+          <w:sz w:val="18"/>
+          <w:shd w:val="clear" w:color="auto" w:fill="F2F2F2"/>
+        </w:rPr>
         <w:t xml:space="preserve">            print(</w:t>
       </w:r>
     </w:p>
@@ -3063,7 +4262,7 @@
           <w:sz w:val="18"/>
           <w:shd w:val="clear" w:color="auto" w:fill="F2F2F2"/>
         </w:rPr>
-        <w:t xml:space="preserve">                f"[DASHBOARD] Traffic cleared — Intersection: {payload.intersection_id} | "</w:t>
+        <w:t xml:space="preserve">                f"[DASHBOARD] Traffic cleared - Intersection: {payload.intersection_id} | "</w:t>
       </w:r>
     </w:p>
     <w:p>
@@ -3131,7 +4330,7 @@
           <w:sz w:val="18"/>
           <w:shd w:val="clear" w:color="auto" w:fill="F2F2F2"/>
         </w:rPr>
-        <w:t>class ReportingService(IEventSubscriber):</w:t>
+        <w:t>class ReportingService(IdempotentReceiver, IEventSubscriber):</w:t>
       </w:r>
     </w:p>
     <w:p>
@@ -3241,6 +4440,20 @@
           <w:sz w:val="18"/>
           <w:shd w:val="clear" w:color="auto" w:fill="F2F2F2"/>
         </w:rPr>
+        <w:t xml:space="preserve">        super().__init__()</w:t>
+      </w:r>
+    </w:p>
+    <w:p>
+      <w:pPr>
+        <w:spacing w:before="0" w:after="0" w:line="240" w:lineRule="auto"/>
+      </w:pPr>
+      <w:r>
+        <w:rPr>
+          <w:rFonts w:ascii="Consolas" w:hAnsi="Consolas"/>
+          <w:color w:val="1E1E1E"/>
+          <w:sz w:val="18"/>
+          <w:shd w:val="clear" w:color="auto" w:fill="F2F2F2"/>
+        </w:rPr>
         <w:t xml:space="preserve">        self.report_data = []</w:t>
       </w:r>
     </w:p>
@@ -3268,7 +4481,7 @@
           <w:sz w:val="18"/>
           <w:shd w:val="clear" w:color="auto" w:fill="F2F2F2"/>
         </w:rPr>
-        <w:t xml:space="preserve">    def on_event(self, envelope):</w:t>
+        <w:t xml:space="preserve">    def process_event(self, envelope):</w:t>
       </w:r>
     </w:p>
     <w:p>
@@ -3389,7 +4602,7 @@
           <w:rFonts w:ascii="Times New Roman" w:hAnsi="Times New Roman"/>
           <w:sz w:val="24"/>
         </w:rPr>
-        <w:t>The main.py script demonstrates the complete system in action. It creates an EventBus, instantiates all four subscriber services, subscribes them, and publishes one event of each type. It then demonstrates the unsubscribe capability by removing DashboardService and publishing an additional event to show that only the remaining subscribers receive it. A final summary displays the penalty count, log entries, and report data points collected.</w:t>
+        <w:t>The main.py script demonstrates the complete system in action. It creates an EventBus, instantiates all four subscriber services, subscribes them, and publishes one event of each type. It then demonstrates the unsubscribe capability by removing DashboardService and publishing an additional event to show that only the remaining subscribers receive it. Finally, it publishes EmergencyVehicleEvent to prove a fifth event type can be added without changing EventBus or any existing subscriber classes.</w:t>
       </w:r>
     </w:p>
     <w:p>
@@ -3501,6 +4714,20 @@
           <w:sz w:val="18"/>
           <w:shd w:val="clear" w:color="auto" w:fill="F2F2F2"/>
         </w:rPr>
+        <w:t xml:space="preserve">    EmergencyVehicleEvent,</w:t>
+      </w:r>
+    </w:p>
+    <w:p>
+      <w:pPr>
+        <w:spacing w:before="0" w:after="0" w:line="240" w:lineRule="auto"/>
+      </w:pPr>
+      <w:r>
+        <w:rPr>
+          <w:rFonts w:ascii="Consolas" w:hAnsi="Consolas"/>
+          <w:color w:val="1E1E1E"/>
+          <w:sz w:val="18"/>
+          <w:shd w:val="clear" w:color="auto" w:fill="F2F2F2"/>
+        </w:rPr>
         <w:t>)</w:t>
       </w:r>
     </w:p>
@@ -5016,6 +6243,284 @@
           <w:shd w:val="clear" w:color="auto" w:fill="F2F2F2"/>
         </w:rPr>
         <w:t>print("(Notice: DashboardService did NOT receive this event)\n")</w:t>
+      </w:r>
+    </w:p>
+    <w:p>
+      <w:pPr>
+        <w:spacing w:before="0" w:after="0" w:line="240" w:lineRule="auto"/>
+      </w:pPr>
+      <w:r>
+        <w:rPr>
+          <w:rFonts w:ascii="Consolas" w:hAnsi="Consolas"/>
+          <w:color w:val="1E1E1E"/>
+          <w:sz w:val="18"/>
+          <w:shd w:val="clear" w:color="auto" w:fill="F2F2F2"/>
+        </w:rPr>
+      </w:r>
+    </w:p>
+    <w:p>
+      <w:pPr>
+        <w:spacing w:before="0" w:after="0" w:line="240" w:lineRule="auto"/>
+      </w:pPr>
+      <w:r>
+        <w:rPr>
+          <w:rFonts w:ascii="Consolas" w:hAnsi="Consolas"/>
+          <w:color w:val="1E1E1E"/>
+          <w:sz w:val="18"/>
+          <w:shd w:val="clear" w:color="auto" w:fill="F2F2F2"/>
+        </w:rPr>
+        <w:t># Demonstrate adding a 5th event type without changing EventBus or existing services.</w:t>
+      </w:r>
+    </w:p>
+    <w:p>
+      <w:pPr>
+        <w:spacing w:before="0" w:after="0" w:line="240" w:lineRule="auto"/>
+      </w:pPr>
+      <w:r>
+        <w:rPr>
+          <w:rFonts w:ascii="Consolas" w:hAnsi="Consolas"/>
+          <w:color w:val="1E1E1E"/>
+          <w:sz w:val="18"/>
+          <w:shd w:val="clear" w:color="auto" w:fill="F2F2F2"/>
+        </w:rPr>
+        <w:t>print("=" * 50)</w:t>
+      </w:r>
+    </w:p>
+    <w:p>
+      <w:pPr>
+        <w:spacing w:before="0" w:after="0" w:line="240" w:lineRule="auto"/>
+      </w:pPr>
+      <w:r>
+        <w:rPr>
+          <w:rFonts w:ascii="Consolas" w:hAnsi="Consolas"/>
+          <w:color w:val="1E1E1E"/>
+          <w:sz w:val="18"/>
+          <w:shd w:val="clear" w:color="auto" w:fill="F2F2F2"/>
+        </w:rPr>
+        <w:t>print("=== Demonstrating 5th Event Type Extensibility ===")</w:t>
+      </w:r>
+    </w:p>
+    <w:p>
+      <w:pPr>
+        <w:spacing w:before="0" w:after="0" w:line="240" w:lineRule="auto"/>
+      </w:pPr>
+      <w:r>
+        <w:rPr>
+          <w:rFonts w:ascii="Consolas" w:hAnsi="Consolas"/>
+          <w:color w:val="1E1E1E"/>
+          <w:sz w:val="18"/>
+          <w:shd w:val="clear" w:color="auto" w:fill="F2F2F2"/>
+        </w:rPr>
+        <w:t>print("=" * 50)</w:t>
+      </w:r>
+    </w:p>
+    <w:p>
+      <w:pPr>
+        <w:spacing w:before="0" w:after="0" w:line="240" w:lineRule="auto"/>
+      </w:pPr>
+      <w:r>
+        <w:rPr>
+          <w:rFonts w:ascii="Consolas" w:hAnsi="Consolas"/>
+          <w:color w:val="1E1E1E"/>
+          <w:sz w:val="18"/>
+          <w:shd w:val="clear" w:color="auto" w:fill="F2F2F2"/>
+        </w:rPr>
+      </w:r>
+    </w:p>
+    <w:p>
+      <w:pPr>
+        <w:spacing w:before="0" w:after="0" w:line="240" w:lineRule="auto"/>
+      </w:pPr>
+      <w:r>
+        <w:rPr>
+          <w:rFonts w:ascii="Consolas" w:hAnsi="Consolas"/>
+          <w:color w:val="1E1E1E"/>
+          <w:sz w:val="18"/>
+          <w:shd w:val="clear" w:color="auto" w:fill="F2F2F2"/>
+        </w:rPr>
+        <w:t>emergency_event = EmergencyVehicleEvent(</w:t>
+      </w:r>
+    </w:p>
+    <w:p>
+      <w:pPr>
+        <w:spacing w:before="0" w:after="0" w:line="240" w:lineRule="auto"/>
+      </w:pPr>
+      <w:r>
+        <w:rPr>
+          <w:rFonts w:ascii="Consolas" w:hAnsi="Consolas"/>
+          <w:color w:val="1E1E1E"/>
+          <w:sz w:val="18"/>
+          <w:shd w:val="clear" w:color="auto" w:fill="F2F2F2"/>
+        </w:rPr>
+        <w:t xml:space="preserve">    vehicle_id="EV001",</w:t>
+      </w:r>
+    </w:p>
+    <w:p>
+      <w:pPr>
+        <w:spacing w:before="0" w:after="0" w:line="240" w:lineRule="auto"/>
+      </w:pPr>
+      <w:r>
+        <w:rPr>
+          <w:rFonts w:ascii="Consolas" w:hAnsi="Consolas"/>
+          <w:color w:val="1E1E1E"/>
+          <w:sz w:val="18"/>
+          <w:shd w:val="clear" w:color="auto" w:fill="F2F2F2"/>
+        </w:rPr>
+        <w:t xml:space="preserve">    plate_number="EMG-911",</w:t>
+      </w:r>
+    </w:p>
+    <w:p>
+      <w:pPr>
+        <w:spacing w:before="0" w:after="0" w:line="240" w:lineRule="auto"/>
+      </w:pPr>
+      <w:r>
+        <w:rPr>
+          <w:rFonts w:ascii="Consolas" w:hAnsi="Consolas"/>
+          <w:color w:val="1E1E1E"/>
+          <w:sz w:val="18"/>
+          <w:shd w:val="clear" w:color="auto" w:fill="F2F2F2"/>
+        </w:rPr>
+        <w:t xml:space="preserve">    vehicle_type="Ambulance",</w:t>
+      </w:r>
+    </w:p>
+    <w:p>
+      <w:pPr>
+        <w:spacing w:before="0" w:after="0" w:line="240" w:lineRule="auto"/>
+      </w:pPr>
+      <w:r>
+        <w:rPr>
+          <w:rFonts w:ascii="Consolas" w:hAnsi="Consolas"/>
+          <w:color w:val="1E1E1E"/>
+          <w:sz w:val="18"/>
+          <w:shd w:val="clear" w:color="auto" w:fill="F2F2F2"/>
+        </w:rPr>
+        <w:t xml:space="preserve">    priority_level="CRITICAL",</w:t>
+      </w:r>
+    </w:p>
+    <w:p>
+      <w:pPr>
+        <w:spacing w:before="0" w:after="0" w:line="240" w:lineRule="auto"/>
+      </w:pPr>
+      <w:r>
+        <w:rPr>
+          <w:rFonts w:ascii="Consolas" w:hAnsi="Consolas"/>
+          <w:color w:val="1E1E1E"/>
+          <w:sz w:val="18"/>
+          <w:shd w:val="clear" w:color="auto" w:fill="F2F2F2"/>
+        </w:rPr>
+        <w:t xml:space="preserve">    camera_id="CAM_04",</w:t>
+      </w:r>
+    </w:p>
+    <w:p>
+      <w:pPr>
+        <w:spacing w:before="0" w:after="0" w:line="240" w:lineRule="auto"/>
+      </w:pPr>
+      <w:r>
+        <w:rPr>
+          <w:rFonts w:ascii="Consolas" w:hAnsi="Consolas"/>
+          <w:color w:val="1E1E1E"/>
+          <w:sz w:val="18"/>
+          <w:shd w:val="clear" w:color="auto" w:fill="F2F2F2"/>
+        </w:rPr>
+        <w:t>)</w:t>
+      </w:r>
+    </w:p>
+    <w:p>
+      <w:pPr>
+        <w:spacing w:before="0" w:after="0" w:line="240" w:lineRule="auto"/>
+      </w:pPr>
+      <w:r>
+        <w:rPr>
+          <w:rFonts w:ascii="Consolas" w:hAnsi="Consolas"/>
+          <w:color w:val="1E1E1E"/>
+          <w:sz w:val="18"/>
+          <w:shd w:val="clear" w:color="auto" w:fill="F2F2F2"/>
+        </w:rPr>
+        <w:t>envelope6 = EventEnvelope(</w:t>
+      </w:r>
+    </w:p>
+    <w:p>
+      <w:pPr>
+        <w:spacing w:before="0" w:after="0" w:line="240" w:lineRule="auto"/>
+      </w:pPr>
+      <w:r>
+        <w:rPr>
+          <w:rFonts w:ascii="Consolas" w:hAnsi="Consolas"/>
+          <w:color w:val="1E1E1E"/>
+          <w:sz w:val="18"/>
+          <w:shd w:val="clear" w:color="auto" w:fill="F2F2F2"/>
+        </w:rPr>
+        <w:t xml:space="preserve">    correlation_id="EMERGENCY_001",</w:t>
+      </w:r>
+    </w:p>
+    <w:p>
+      <w:pPr>
+        <w:spacing w:before="0" w:after="0" w:line="240" w:lineRule="auto"/>
+      </w:pPr>
+      <w:r>
+        <w:rPr>
+          <w:rFonts w:ascii="Consolas" w:hAnsi="Consolas"/>
+          <w:color w:val="1E1E1E"/>
+          <w:sz w:val="18"/>
+          <w:shd w:val="clear" w:color="auto" w:fill="F2F2F2"/>
+        </w:rPr>
+        <w:t xml:space="preserve">    source_id="CAM_04",</w:t>
+      </w:r>
+    </w:p>
+    <w:p>
+      <w:pPr>
+        <w:spacing w:before="0" w:after="0" w:line="240" w:lineRule="auto"/>
+      </w:pPr>
+      <w:r>
+        <w:rPr>
+          <w:rFonts w:ascii="Consolas" w:hAnsi="Consolas"/>
+          <w:color w:val="1E1E1E"/>
+          <w:sz w:val="18"/>
+          <w:shd w:val="clear" w:color="auto" w:fill="F2F2F2"/>
+        </w:rPr>
+        <w:t xml:space="preserve">    payload=emergency_event,</w:t>
+      </w:r>
+    </w:p>
+    <w:p>
+      <w:pPr>
+        <w:spacing w:before="0" w:after="0" w:line="240" w:lineRule="auto"/>
+      </w:pPr>
+      <w:r>
+        <w:rPr>
+          <w:rFonts w:ascii="Consolas" w:hAnsi="Consolas"/>
+          <w:color w:val="1E1E1E"/>
+          <w:sz w:val="18"/>
+          <w:shd w:val="clear" w:color="auto" w:fill="F2F2F2"/>
+        </w:rPr>
+        <w:t>)</w:t>
+      </w:r>
+    </w:p>
+    <w:p>
+      <w:pPr>
+        <w:spacing w:before="0" w:after="0" w:line="240" w:lineRule="auto"/>
+      </w:pPr>
+      <w:r>
+        <w:rPr>
+          <w:rFonts w:ascii="Consolas" w:hAnsi="Consolas"/>
+          <w:color w:val="1E1E1E"/>
+          <w:sz w:val="18"/>
+          <w:shd w:val="clear" w:color="auto" w:fill="F2F2F2"/>
+        </w:rPr>
+        <w:t>bus.publish(envelope6)</w:t>
+      </w:r>
+    </w:p>
+    <w:p>
+      <w:pPr>
+        <w:spacing w:before="0" w:after="0" w:line="240" w:lineRule="auto"/>
+      </w:pPr>
+      <w:r>
+        <w:rPr>
+          <w:rFonts w:ascii="Consolas" w:hAnsi="Consolas"/>
+          <w:color w:val="1E1E1E"/>
+          <w:sz w:val="18"/>
+          <w:shd w:val="clear" w:color="auto" w:fill="F2F2F2"/>
+        </w:rPr>
+        <w:t>print("EmergencyVehicleEvent was delivered without changing EventBus.\n")</w:t>
       </w:r>
     </w:p>
     <w:p>
@@ -5161,32 +6666,41 @@
     </w:p>
     <w:p>
       <w:pPr>
-        <w:spacing w:before="400" w:after="400"/>
         <w:jc w:val="center"/>
       </w:pPr>
       <w:r>
-        <w:rPr>
-          <w:rFonts w:ascii="Times New Roman" w:hAnsi="Times New Roman"/>
-          <w:b/>
-          <w:color w:val="B40000"/>
-          <w:sz w:val="28"/>
-        </w:rPr>
-        <w:t>[INSERT UML_Diagram.png HERE]</w:t>
-      </w:r>
-    </w:p>
-    <w:p>
-      <w:pPr>
-        <w:jc w:val="center"/>
-      </w:pPr>
-      <w:r>
-        <w:rPr>
-          <w:i/>
-          <w:color w:val="646464"/>
-          <w:sz w:val="20"/>
-        </w:rPr>
-        <w:t>Export your draw.io diagram as UML_Diagram.png and place it in the report/ folder.</w:t>
-        <w:br/>
-        <w:t>Then re-run this script to embed it automatically.</w:t>
+        <w:drawing>
+          <wp:inline xmlns:a="http://schemas.openxmlformats.org/drawingml/2006/main" xmlns:pic="http://schemas.openxmlformats.org/drawingml/2006/picture">
+            <wp:extent cx="5486400" cy="3043181"/>
+            <wp:docPr id="1" name="Picture 1"/>
+            <wp:cNvGraphicFramePr>
+              <a:graphicFrameLocks noChangeAspect="1"/>
+            </wp:cNvGraphicFramePr>
+            <a:graphic>
+              <a:graphicData uri="http://schemas.openxmlformats.org/drawingml/2006/picture">
+                <pic:pic>
+                  <pic:nvPicPr>
+                    <pic:cNvPr id="0" name="UML_Diagram.png"/>
+                    <pic:cNvPicPr/>
+                  </pic:nvPicPr>
+                  <pic:blipFill>
+                    <a:blip r:embed="rId9"/>
+                    <a:stretch>
+                      <a:fillRect/>
+                    </a:stretch>
+                  </pic:blipFill>
+                  <pic:spPr>
+                    <a:xfrm>
+                      <a:off x="0" y="0"/>
+                      <a:ext cx="5486400" cy="3043181"/>
+                    </a:xfrm>
+                    <a:prstGeom prst="rect"/>
+                  </pic:spPr>
+                </pic:pic>
+              </a:graphicData>
+            </a:graphic>
+          </wp:inline>
+        </w:drawing>
       </w:r>
     </w:p>
     <w:p>
@@ -5854,7 +7368,7 @@
           <w:rFonts w:ascii="Times New Roman" w:hAnsi="Times New Roman"/>
           <w:sz w:val="24"/>
         </w:rPr>
-        <w:t>A bounded queue is a FIFO data structure with a fixed maximum capacity. Once full, any new enqueue triggers a predefined overflow action. Implementation involves assigning each subscriber a per-subscriber bounded queue (e.g., Python collections.deque with maxlen). The publish() method appends to queues rather than calling on_event() directly, and a dedicated worker thread drains each queue at the subscriber's natural processing rate.</w:t>
+        <w:t>A bounded queue is a FIFO data structure with a fixed maximum capacity. Once full, any new enqueue triggers a predefined overflow action. Implementation involves assigning each subscriber a per-subscriber bounded queue using Python collections.deque. In the implementation, publish() appends envelopes to subscriber queues, flush() drains the queues, and max_queue_size activates overflow protection. This keeps normal delivery simple while proving the bounded-queue tactic required for overload conditions.</w:t>
       </w:r>
     </w:p>
     <w:p>
@@ -6775,7 +8289,7 @@
           <w:rFonts w:ascii="Times New Roman" w:hAnsi="Times New Roman"/>
           <w:sz w:val="24"/>
         </w:rPr>
-        <w:t>This report has presented the complete design, implementation, and critical analysis of an Event-Driven Traffic Alert System built in Python 3. The system demonstrates three foundational design patterns — the Observer Pattern for decoupled event delivery via the EventBus, the Event Envelope Pattern for metadata-rich event wrapping enabling traceability and versioning, and the Idempotent Receiver Pattern for safe duplicate rejection in AlertService and LoggingService. The CLO 4 analysis examined three real-world architectural challenges: schema evolution was addressed through backward-compatible optional fields guided by a formal Architecture Decision Record; event flooding during peak traffic was mitigated through bounded queues with priority-based eviction, supported by mathematical verification showing a 23.81-second overflow window; and the Dual Write Problem was resolved through the Outbox Pattern, ensuring that legally admissible audit trails are never lost to subscriber failures. Together, these patterns and analyses demonstrate a system architecture that is extensible, fault-tolerant, and suitable for safety-critical traffic enforcement in a metropolitan environment.</w:t>
+        <w:t>This report has presented the complete design, implementation, and critical analysis of an Event-Driven Traffic Alert System built in Python 3. The system demonstrates three foundational design patterns — the Observer Pattern for decoupled event delivery via the EventBus, the Event Envelope Pattern for metadata-rich event wrapping enabling traceability and versioning, and the Idempotent Receiver Pattern for safe duplicate rejection across all subscriber services. The CLO 4 analysis examined three real-world architectural challenges: schema evolution was addressed through backward-compatible optional fields guided by a formal Architecture Decision Record; event flooding during peak traffic was mitigated through bounded queues with priority-based eviction, supported by mathematical verification showing a 23.81-second overflow window; and the Dual Write Problem was resolved through the Outbox Pattern, ensuring that legally admissible audit trails are never lost to subscriber failures. Together, these patterns and analyses demonstrate a system architecture that is extensible, fault-tolerant, and suitable for safety-critical traffic enforcement in a metropolitan environment.</w:t>
       </w:r>
     </w:p>
     <w:sectPr>

</xml_diff>